<commit_message>
Miscellaneous Updates - worksheets
</commit_message>
<xml_diff>
--- a/Worksheets/Worksheet4_Bayesian_2026.docx
+++ b/Worksheets/Worksheet4_Bayesian_2026.docx
@@ -726,10 +726,9 @@
     </w:p>
     <w:p>
       <w:pPr>
-        <w:pStyle w:val="ListParagraph"/>
-        <w:spacing w:after="0"/>
-        <w:rPr>
-          <w:rFonts w:ascii="Arial" w:hAnsi="Arial" w:cs="Arial"/>
+        <w:rPr>
+          <w:rFonts w:ascii="Arial" w:hAnsi="Arial" w:cs="Arial"/>
+          <w:b/>
           <w:sz w:val="24"/>
           <w:szCs w:val="24"/>
         </w:rPr>
@@ -744,23 +743,14 @@
           <w:szCs w:val="24"/>
         </w:rPr>
       </w:pPr>
-    </w:p>
-    <w:p>
-      <w:pPr>
+      <w:r>
         <w:rPr>
           <w:rFonts w:ascii="Arial" w:hAnsi="Arial" w:cs="Arial"/>
           <w:b/>
           <w:sz w:val="24"/>
           <w:szCs w:val="24"/>
         </w:rPr>
-      </w:pPr>
-      <w:r>
-        <w:rPr>
-          <w:rFonts w:ascii="Arial" w:hAnsi="Arial" w:cs="Arial"/>
-          <w:b/>
-          <w:sz w:val="24"/>
-          <w:szCs w:val="24"/>
-        </w:rPr>
+        <w:lastRenderedPageBreak/>
         <w:t xml:space="preserve">Table </w:t>
       </w:r>
       <w:r>
@@ -4180,6 +4170,31 @@
       <w:pPr>
         <w:pStyle w:val="ListParagraph"/>
         <w:numPr>
+          <w:ilvl w:val="1"/>
+          <w:numId w:val="9"/>
+        </w:numPr>
+        <w:spacing w:after="0"/>
+        <w:rPr>
+          <w:rFonts w:ascii="Arial" w:hAnsi="Arial" w:cs="Arial"/>
+          <w:color w:val="7030A0"/>
+          <w:sz w:val="24"/>
+          <w:szCs w:val="24"/>
+        </w:rPr>
+      </w:pPr>
+      <w:r>
+        <w:rPr>
+          <w:rFonts w:ascii="Arial" w:hAnsi="Arial" w:cs="Arial"/>
+          <w:color w:val="7030A0"/>
+          <w:sz w:val="24"/>
+          <w:szCs w:val="24"/>
+        </w:rPr>
+        <w:t>Significant change in WAIC from intercept only model to these models</w:t>
+      </w:r>
+    </w:p>
+    <w:p>
+      <w:pPr>
+        <w:pStyle w:val="ListParagraph"/>
+        <w:numPr>
           <w:ilvl w:val="0"/>
           <w:numId w:val="9"/>
         </w:numPr>
@@ -4235,6 +4250,31 @@
           <w:szCs w:val="24"/>
         </w:rPr>
         <w:t>95% HPDI’s do contain 0</w:t>
+      </w:r>
+    </w:p>
+    <w:p>
+      <w:pPr>
+        <w:pStyle w:val="ListParagraph"/>
+        <w:numPr>
+          <w:ilvl w:val="1"/>
+          <w:numId w:val="9"/>
+        </w:numPr>
+        <w:spacing w:after="0"/>
+        <w:rPr>
+          <w:rFonts w:ascii="Arial" w:hAnsi="Arial" w:cs="Arial"/>
+          <w:color w:val="7030A0"/>
+          <w:sz w:val="24"/>
+          <w:szCs w:val="24"/>
+        </w:rPr>
+      </w:pPr>
+      <w:r>
+        <w:rPr>
+          <w:rFonts w:ascii="Arial" w:hAnsi="Arial" w:cs="Arial"/>
+          <w:color w:val="7030A0"/>
+          <w:sz w:val="24"/>
+          <w:szCs w:val="24"/>
+        </w:rPr>
+        <w:t>WAIC was almost the same as the intercept only model</w:t>
       </w:r>
     </w:p>
     <w:p>
@@ -4399,6 +4439,31 @@
       <w:pPr>
         <w:pStyle w:val="ListParagraph"/>
         <w:numPr>
+          <w:ilvl w:val="1"/>
+          <w:numId w:val="10"/>
+        </w:numPr>
+        <w:spacing w:after="0"/>
+        <w:rPr>
+          <w:rFonts w:ascii="Arial" w:hAnsi="Arial" w:cs="Arial"/>
+          <w:color w:val="7030A0"/>
+          <w:sz w:val="24"/>
+          <w:szCs w:val="24"/>
+        </w:rPr>
+      </w:pPr>
+      <w:r>
+        <w:rPr>
+          <w:rFonts w:ascii="Arial" w:hAnsi="Arial" w:cs="Arial"/>
+          <w:color w:val="7030A0"/>
+          <w:sz w:val="24"/>
+          <w:szCs w:val="24"/>
+        </w:rPr>
+        <w:t>WAIC increases compared to full model value</w:t>
+      </w:r>
+    </w:p>
+    <w:p>
+      <w:pPr>
+        <w:pStyle w:val="ListParagraph"/>
+        <w:numPr>
           <w:ilvl w:val="0"/>
           <w:numId w:val="10"/>
         </w:numPr>
@@ -4417,61 +4482,7 @@
           <w:sz w:val="24"/>
           <w:szCs w:val="24"/>
         </w:rPr>
-        <w:t>After adjusting for other covariates,</w:t>
-      </w:r>
-      <w:r>
-        <w:rPr>
-          <w:rFonts w:ascii="Arial" w:hAnsi="Arial" w:cs="Arial"/>
-          <w:color w:val="7030A0"/>
-          <w:sz w:val="24"/>
-          <w:szCs w:val="24"/>
-        </w:rPr>
-        <w:t xml:space="preserve"> age, benign hyperplasia,</w:t>
-      </w:r>
-      <w:r>
-        <w:rPr>
-          <w:rFonts w:ascii="Arial" w:hAnsi="Arial" w:cs="Arial"/>
-          <w:color w:val="7030A0"/>
-          <w:sz w:val="24"/>
-          <w:szCs w:val="24"/>
-        </w:rPr>
-        <w:t xml:space="preserve"> </w:t>
-      </w:r>
-      <w:r>
-        <w:rPr>
-          <w:rFonts w:ascii="Arial" w:hAnsi="Arial" w:cs="Arial"/>
-          <w:color w:val="7030A0"/>
-          <w:sz w:val="24"/>
-          <w:szCs w:val="24"/>
-        </w:rPr>
-        <w:t xml:space="preserve">prostate weight, capsular penetration, and Gleason 7 </w:t>
-      </w:r>
-      <w:r>
-        <w:rPr>
-          <w:rFonts w:ascii="Arial" w:hAnsi="Arial" w:cs="Arial"/>
-          <w:color w:val="7030A0"/>
-          <w:sz w:val="24"/>
-          <w:szCs w:val="24"/>
-        </w:rPr>
-        <w:t xml:space="preserve">are </w:t>
-      </w:r>
-      <w:r>
-        <w:rPr>
-          <w:rFonts w:ascii="Arial" w:hAnsi="Arial" w:cs="Arial"/>
-          <w:color w:val="7030A0"/>
-          <w:sz w:val="24"/>
-          <w:szCs w:val="24"/>
-        </w:rPr>
-        <w:t xml:space="preserve">not </w:t>
-      </w:r>
-      <w:r>
-        <w:rPr>
-          <w:rFonts w:ascii="Arial" w:hAnsi="Arial" w:cs="Arial"/>
-          <w:color w:val="7030A0"/>
-          <w:sz w:val="24"/>
-          <w:szCs w:val="24"/>
-        </w:rPr>
-        <w:t xml:space="preserve">associated with </w:t>
+        <w:t xml:space="preserve">After adjusting for other covariates, age, benign hyperplasia, prostate weight, capsular penetration, and Gleason 7 are not associated with </w:t>
       </w:r>
       <w:proofErr w:type="gramStart"/>
       <w:r>
@@ -4517,6 +4528,31 @@
           <w:szCs w:val="24"/>
         </w:rPr>
         <w:t>95% HPDI’s do contain 0</w:t>
+      </w:r>
+    </w:p>
+    <w:p>
+      <w:pPr>
+        <w:pStyle w:val="ListParagraph"/>
+        <w:numPr>
+          <w:ilvl w:val="1"/>
+          <w:numId w:val="10"/>
+        </w:numPr>
+        <w:spacing w:after="0"/>
+        <w:rPr>
+          <w:rFonts w:ascii="Arial" w:hAnsi="Arial" w:cs="Arial"/>
+          <w:color w:val="7030A0"/>
+          <w:sz w:val="24"/>
+          <w:szCs w:val="24"/>
+        </w:rPr>
+      </w:pPr>
+      <w:r>
+        <w:rPr>
+          <w:rFonts w:ascii="Arial" w:hAnsi="Arial" w:cs="Arial"/>
+          <w:color w:val="7030A0"/>
+          <w:sz w:val="24"/>
+          <w:szCs w:val="24"/>
+        </w:rPr>
+        <w:t>WAIC decreases or stays relatively close to full model values</w:t>
       </w:r>
     </w:p>
     <w:p>
@@ -4940,6 +4976,7 @@
           <w:sz w:val="24"/>
           <w:szCs w:val="24"/>
         </w:rPr>
+        <w:lastRenderedPageBreak/>
         <w:drawing>
           <wp:inline distT="0" distB="0" distL="0" distR="0" wp14:anchorId="3003394A" wp14:editId="4E8B9964">
             <wp:extent cx="4410346" cy="2044277"/>
@@ -4992,7 +5029,6 @@
           <w:sz w:val="24"/>
           <w:szCs w:val="24"/>
         </w:rPr>
-        <w:lastRenderedPageBreak/>
         <w:t xml:space="preserve">Trace plots across the 25,000 iterations for the 4 chains. The regression coefficients (betas) are: 1) Intercept, 2) </w:t>
       </w:r>
       <w:proofErr w:type="spellStart"/>
@@ -5261,7 +5297,44 @@
           <w:sz w:val="24"/>
           <w:szCs w:val="24"/>
         </w:rPr>
-        <w:t xml:space="preserve">, 8) Gleason Grade 7, 9) Gleason Grade 8.  </w:t>
+        <w:t xml:space="preserve">, 8) Gleason Grade 7, 9) Gleason Grade 8. </w:t>
+      </w:r>
+    </w:p>
+    <w:p>
+      <w:pPr>
+        <w:spacing w:after="0"/>
+        <w:rPr>
+          <w:rFonts w:ascii="Arial" w:hAnsi="Arial" w:cs="Arial"/>
+          <w:sz w:val="24"/>
+          <w:szCs w:val="24"/>
+        </w:rPr>
+      </w:pPr>
+    </w:p>
+    <w:p>
+      <w:pPr>
+        <w:spacing w:after="0"/>
+        <w:rPr>
+          <w:rFonts w:ascii="Arial" w:hAnsi="Arial" w:cs="Arial"/>
+          <w:sz w:val="24"/>
+          <w:szCs w:val="24"/>
+        </w:rPr>
+      </w:pPr>
+      <w:r>
+        <w:rPr>
+          <w:rFonts w:ascii="Arial" w:hAnsi="Arial" w:cs="Arial"/>
+          <w:color w:val="7030A0"/>
+          <w:sz w:val="24"/>
+          <w:szCs w:val="24"/>
+        </w:rPr>
+        <w:t>Overall, our group agreed that the diagnostic plots looked good.</w:t>
+      </w:r>
+      <w:r>
+        <w:rPr>
+          <w:rFonts w:ascii="Arial" w:hAnsi="Arial" w:cs="Arial"/>
+          <w:sz w:val="24"/>
+          <w:szCs w:val="24"/>
+        </w:rPr>
+        <w:t xml:space="preserve"> </w:t>
       </w:r>
     </w:p>
     <w:p>
@@ -5671,6 +5744,7 @@
           <w:sz w:val="28"/>
           <w:szCs w:val="28"/>
         </w:rPr>
+        <w:lastRenderedPageBreak/>
         <w:t xml:space="preserve">Table </w:t>
       </w:r>
       <w:r>
@@ -8127,7 +8201,6 @@
                 <w:sz w:val="20"/>
                 <w:szCs w:val="20"/>
               </w:rPr>
-              <w:lastRenderedPageBreak/>
               <w:t>cavol</w:t>
             </w:r>
             <w:proofErr w:type="spellEnd"/>
@@ -13092,7 +13165,34 @@
           <w:sz w:val="24"/>
           <w:szCs w:val="24"/>
         </w:rPr>
-        <w:t>Cancer Volume is associated with Capsular Penetration</w:t>
+        <w:t>Cancer Volume is</w:t>
+      </w:r>
+      <w:r>
+        <w:rPr>
+          <w:rFonts w:ascii="Arial" w:hAnsi="Arial" w:cs="Arial"/>
+          <w:color w:val="7030A0"/>
+          <w:sz w:val="24"/>
+          <w:szCs w:val="24"/>
+        </w:rPr>
+        <w:t xml:space="preserve"> strongly</w:t>
+      </w:r>
+      <w:r>
+        <w:rPr>
+          <w:rFonts w:ascii="Arial" w:hAnsi="Arial" w:cs="Arial"/>
+          <w:color w:val="7030A0"/>
+          <w:sz w:val="24"/>
+          <w:szCs w:val="24"/>
+        </w:rPr>
+        <w:t xml:space="preserve"> associated with Capsular Penetration</w:t>
+      </w:r>
+      <w:r>
+        <w:rPr>
+          <w:rFonts w:ascii="Arial" w:hAnsi="Arial" w:cs="Arial"/>
+          <w:color w:val="7030A0"/>
+          <w:sz w:val="24"/>
+          <w:szCs w:val="24"/>
+        </w:rPr>
+        <w:t xml:space="preserve"> (0.7)</w:t>
       </w:r>
     </w:p>
     <w:p>
@@ -13100,7 +13200,7 @@
         <w:pStyle w:val="ListParagraph"/>
         <w:widowControl w:val="0"/>
         <w:numPr>
-          <w:ilvl w:val="1"/>
+          <w:ilvl w:val="0"/>
           <w:numId w:val="11"/>
         </w:numPr>
         <w:tabs>
@@ -13118,6 +13218,7 @@
           <w:szCs w:val="24"/>
         </w:rPr>
       </w:pPr>
+      <w:proofErr w:type="gramStart"/>
       <w:r>
         <w:rPr>
           <w:rFonts w:ascii="Arial" w:hAnsi="Arial" w:cs="Arial"/>
@@ -13125,7 +13226,17 @@
           <w:sz w:val="24"/>
           <w:szCs w:val="24"/>
         </w:rPr>
-        <w:t>The correlation value is 1</w:t>
+        <w:t>Log(</w:t>
+      </w:r>
+      <w:proofErr w:type="gramEnd"/>
+      <w:r>
+        <w:rPr>
+          <w:rFonts w:ascii="Arial" w:hAnsi="Arial" w:cs="Arial"/>
+          <w:color w:val="7030A0"/>
+          <w:sz w:val="24"/>
+          <w:szCs w:val="24"/>
+        </w:rPr>
+        <w:t>PSA) is moderately associated with cancer volume and capsular penetration (0.62, 0.55)</w:t>
       </w:r>
     </w:p>
     <w:p>
@@ -13222,6 +13333,44 @@
           <w:szCs w:val="24"/>
         </w:rPr>
       </w:pPr>
+      <w:r>
+        <w:rPr>
+          <w:rFonts w:ascii="Arial" w:hAnsi="Arial" w:cs="Arial"/>
+          <w:color w:val="7030A0"/>
+          <w:sz w:val="24"/>
+          <w:szCs w:val="24"/>
+        </w:rPr>
+        <w:t>C</w:t>
+      </w:r>
+      <w:r>
+        <w:rPr>
+          <w:rFonts w:ascii="Arial" w:hAnsi="Arial" w:cs="Arial"/>
+          <w:color w:val="7030A0"/>
+          <w:sz w:val="24"/>
+          <w:szCs w:val="24"/>
+        </w:rPr>
+        <w:t xml:space="preserve">ancer volume is potentially confounding the relationship between capsular penetration and </w:t>
+      </w:r>
+      <w:proofErr w:type="gramStart"/>
+      <w:r>
+        <w:rPr>
+          <w:rFonts w:ascii="Arial" w:hAnsi="Arial" w:cs="Arial"/>
+          <w:color w:val="7030A0"/>
+          <w:sz w:val="24"/>
+          <w:szCs w:val="24"/>
+        </w:rPr>
+        <w:t>log(</w:t>
+      </w:r>
+      <w:proofErr w:type="gramEnd"/>
+      <w:r>
+        <w:rPr>
+          <w:rFonts w:ascii="Arial" w:hAnsi="Arial" w:cs="Arial"/>
+          <w:color w:val="7030A0"/>
+          <w:sz w:val="24"/>
+          <w:szCs w:val="24"/>
+        </w:rPr>
+        <w:t>PSA)</w:t>
+      </w:r>
     </w:p>
     <w:p>
       <w:pPr>
@@ -13304,12 +13453,7 @@
     </w:p>
     <w:p>
       <w:pPr>
-        <w:pStyle w:val="ListParagraph"/>
         <w:widowControl w:val="0"/>
-        <w:numPr>
-          <w:ilvl w:val="0"/>
-          <w:numId w:val="11"/>
-        </w:numPr>
         <w:tabs>
           <w:tab w:val="left" w:pos="220"/>
           <w:tab w:val="left" w:pos="720"/>
@@ -13318,11 +13462,279 @@
         <w:autoSpaceDN w:val="0"/>
         <w:adjustRightInd w:val="0"/>
         <w:spacing w:after="293" w:line="340" w:lineRule="atLeast"/>
+        <w:ind w:left="360"/>
+        <w:jc w:val="center"/>
         <w:rPr>
           <w:rFonts w:ascii="Arial" w:hAnsi="Arial" w:cs="Arial"/>
           <w:color w:val="7030A0"/>
           <w:sz w:val="24"/>
           <w:szCs w:val="24"/>
+        </w:rPr>
+      </w:pPr>
+      <w:r>
+        <w:rPr>
+          <w:rFonts w:ascii="Arial" w:hAnsi="Arial" w:cs="Arial"/>
+          <w:noProof/>
+          <w:color w:val="7030A0"/>
+          <w:sz w:val="24"/>
+          <w:szCs w:val="24"/>
+        </w:rPr>
+        <w:lastRenderedPageBreak/>
+        <mc:AlternateContent>
+          <mc:Choice Requires="wpi">
+            <w:drawing>
+              <wp:anchor distT="0" distB="0" distL="114300" distR="114300" simplePos="0" relativeHeight="251659264" behindDoc="0" locked="0" layoutInCell="1" allowOverlap="1" wp14:anchorId="1EB01972" wp14:editId="34A129BB">
+                <wp:simplePos x="0" y="0"/>
+                <wp:positionH relativeFrom="column">
+                  <wp:posOffset>2380375</wp:posOffset>
+                </wp:positionH>
+                <wp:positionV relativeFrom="paragraph">
+                  <wp:posOffset>164805</wp:posOffset>
+                </wp:positionV>
+                <wp:extent cx="534960" cy="224640"/>
+                <wp:effectExtent l="38100" t="38100" r="24130" b="42545"/>
+                <wp:wrapNone/>
+                <wp:docPr id="1720871780" name="Ink 4"/>
+                <wp:cNvGraphicFramePr/>
+                <a:graphic xmlns:a="http://schemas.openxmlformats.org/drawingml/2006/main">
+                  <a:graphicData uri="http://schemas.microsoft.com/office/word/2010/wordprocessingInk">
+                    <w14:contentPart bwMode="auto" r:id="rId11">
+                      <w14:nvContentPartPr>
+                        <w14:cNvContentPartPr/>
+                      </w14:nvContentPartPr>
+                      <w14:xfrm>
+                        <a:off x="0" y="0"/>
+                        <a:ext cx="534960" cy="224640"/>
+                      </w14:xfrm>
+                    </w14:contentPart>
+                  </a:graphicData>
+                </a:graphic>
+              </wp:anchor>
+            </w:drawing>
+          </mc:Choice>
+          <mc:Fallback>
+            <w:pict>
+              <v:shapetype w14:anchorId="324365E8" id="_x0000_t75" coordsize="21600,21600" o:spt="75" o:preferrelative="t" path="m@4@5l@4@11@9@11@9@5xe" filled="f" stroked="f">
+                <v:stroke joinstyle="miter"/>
+                <v:formulas>
+                  <v:f eqn="if lineDrawn pixelLineWidth 0"/>
+                  <v:f eqn="sum @0 1 0"/>
+                  <v:f eqn="sum 0 0 @1"/>
+                  <v:f eqn="prod @2 1 2"/>
+                  <v:f eqn="prod @3 21600 pixelWidth"/>
+                  <v:f eqn="prod @3 21600 pixelHeight"/>
+                  <v:f eqn="sum @0 0 1"/>
+                  <v:f eqn="prod @6 1 2"/>
+                  <v:f eqn="prod @7 21600 pixelWidth"/>
+                  <v:f eqn="sum @8 21600 0"/>
+                  <v:f eqn="prod @7 21600 pixelHeight"/>
+                  <v:f eqn="sum @10 21600 0"/>
+                </v:formulas>
+                <v:path o:extrusionok="f" gradientshapeok="t" o:connecttype="rect"/>
+                <o:lock v:ext="edit" aspectratio="t"/>
+              </v:shapetype>
+              <v:shape id="Ink 4" o:spid="_x0000_s1026" type="#_x0000_t75" style="position:absolute;margin-left:186.95pt;margin-top:12.5pt;width:43.1pt;height:18.7pt;z-index:251659264;visibility:visible;mso-wrap-style:square;mso-wrap-distance-left:9pt;mso-wrap-distance-top:0;mso-wrap-distance-right:9pt;mso-wrap-distance-bottom:0;mso-position-horizontal:absolute;mso-position-horizontal-relative:text;mso-position-vertical:absolute;mso-position-vertical-relative:text" o:gfxdata="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">
+                <v:imagedata r:id="rId12" o:title=""/>
+              </v:shape>
+            </w:pict>
+          </mc:Fallback>
+        </mc:AlternateContent>
+      </w:r>
+      <w:r>
+        <w:rPr>
+          <w:rFonts w:ascii="Arial" w:hAnsi="Arial" w:cs="Arial"/>
+          <w:color w:val="7030A0"/>
+          <w:sz w:val="24"/>
+          <w:szCs w:val="24"/>
+        </w:rPr>
+        <w:t>Cancer Volume</w:t>
+      </w:r>
+    </w:p>
+    <w:p>
+      <w:pPr>
+        <w:widowControl w:val="0"/>
+        <w:tabs>
+          <w:tab w:val="left" w:pos="220"/>
+          <w:tab w:val="left" w:pos="720"/>
+        </w:tabs>
+        <w:autoSpaceDE w:val="0"/>
+        <w:autoSpaceDN w:val="0"/>
+        <w:adjustRightInd w:val="0"/>
+        <w:spacing w:after="293" w:line="340" w:lineRule="atLeast"/>
+        <w:ind w:left="360"/>
+        <w:jc w:val="both"/>
+        <w:rPr>
+          <w:rFonts w:ascii="Arial" w:hAnsi="Arial" w:cs="Arial"/>
+          <w:color w:val="7030A0"/>
+          <w:sz w:val="24"/>
+          <w:szCs w:val="24"/>
+          <w:lang w:val="fr-FR"/>
+        </w:rPr>
+      </w:pPr>
+      <w:r>
+        <w:rPr>
+          <w:rFonts w:ascii="Arial" w:hAnsi="Arial" w:cs="Arial"/>
+          <w:noProof/>
+          <w:color w:val="7030A0"/>
+          <w:sz w:val="24"/>
+          <w:szCs w:val="24"/>
+        </w:rPr>
+        <mc:AlternateContent>
+          <mc:Choice Requires="wpi">
+            <w:drawing>
+              <wp:anchor distT="0" distB="0" distL="114300" distR="114300" simplePos="0" relativeHeight="251662336" behindDoc="0" locked="0" layoutInCell="1" allowOverlap="1" wp14:anchorId="1AA52008" wp14:editId="5284D39E">
+                <wp:simplePos x="0" y="0"/>
+                <wp:positionH relativeFrom="column">
+                  <wp:posOffset>2926080</wp:posOffset>
+                </wp:positionH>
+                <wp:positionV relativeFrom="paragraph">
+                  <wp:posOffset>-252095</wp:posOffset>
+                </wp:positionV>
+                <wp:extent cx="1996715" cy="566420"/>
+                <wp:effectExtent l="0" t="38100" r="0" b="43180"/>
+                <wp:wrapNone/>
+                <wp:docPr id="778841017" name="Ink 7"/>
+                <wp:cNvGraphicFramePr/>
+                <a:graphic xmlns:a="http://schemas.openxmlformats.org/drawingml/2006/main">
+                  <a:graphicData uri="http://schemas.microsoft.com/office/word/2010/wordprocessingInk">
+                    <w14:contentPart bwMode="auto" r:id="rId13">
+                      <w14:nvContentPartPr>
+                        <w14:cNvContentPartPr/>
+                      </w14:nvContentPartPr>
+                      <w14:xfrm>
+                        <a:off x="0" y="0"/>
+                        <a:ext cx="1996715" cy="566420"/>
+                      </w14:xfrm>
+                    </w14:contentPart>
+                  </a:graphicData>
+                </a:graphic>
+              </wp:anchor>
+            </w:drawing>
+          </mc:Choice>
+          <mc:Fallback>
+            <w:pict>
+              <v:shape w14:anchorId="07AECE7B" id="Ink 7" o:spid="_x0000_s1026" type="#_x0000_t75" style="position:absolute;margin-left:229.9pt;margin-top:-20.35pt;width:158.2pt;height:45.55pt;z-index:251662336;visibility:visible;mso-wrap-style:square;mso-wrap-distance-left:9pt;mso-wrap-distance-top:0;mso-wrap-distance-right:9pt;mso-wrap-distance-bottom:0;mso-position-horizontal:absolute;mso-position-horizontal-relative:text;mso-position-vertical:absolute;mso-position-vertical-relative:text" o:gfxdata="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">
+                <v:imagedata r:id="rId14" o:title=""/>
+              </v:shape>
+            </w:pict>
+          </mc:Fallback>
+        </mc:AlternateContent>
+      </w:r>
+      <w:r>
+        <w:rPr>
+          <w:rFonts w:ascii="Arial" w:hAnsi="Arial" w:cs="Arial"/>
+          <w:color w:val="7030A0"/>
+          <w:sz w:val="24"/>
+          <w:szCs w:val="24"/>
+        </w:rPr>
+        <w:tab/>
+      </w:r>
+      <w:r>
+        <w:rPr>
+          <w:rFonts w:ascii="Arial" w:hAnsi="Arial" w:cs="Arial"/>
+          <w:color w:val="7030A0"/>
+          <w:sz w:val="24"/>
+          <w:szCs w:val="24"/>
+        </w:rPr>
+        <w:tab/>
+      </w:r>
+      <w:r>
+        <w:rPr>
+          <w:rFonts w:ascii="Arial" w:hAnsi="Arial" w:cs="Arial"/>
+          <w:color w:val="7030A0"/>
+          <w:sz w:val="24"/>
+          <w:szCs w:val="24"/>
+        </w:rPr>
+        <w:tab/>
+      </w:r>
+      <w:r>
+        <w:rPr>
+          <w:rFonts w:ascii="Arial" w:hAnsi="Arial" w:cs="Arial"/>
+          <w:color w:val="7030A0"/>
+          <w:sz w:val="24"/>
+          <w:szCs w:val="24"/>
+          <w:lang w:val="fr-FR"/>
+        </w:rPr>
+        <w:t>Capsular Penetration</w:t>
+      </w:r>
+      <w:r>
+        <w:rPr>
+          <w:rFonts w:ascii="Arial" w:hAnsi="Arial" w:cs="Arial"/>
+          <w:color w:val="7030A0"/>
+          <w:sz w:val="24"/>
+          <w:szCs w:val="24"/>
+          <w:lang w:val="fr-FR"/>
+        </w:rPr>
+        <w:tab/>
+      </w:r>
+      <w:r>
+        <w:rPr>
+          <w:rFonts w:ascii="Arial" w:hAnsi="Arial" w:cs="Arial"/>
+          <w:color w:val="7030A0"/>
+          <w:sz w:val="24"/>
+          <w:szCs w:val="24"/>
+          <w:lang w:val="fr-FR"/>
+        </w:rPr>
+        <w:tab/>
+      </w:r>
+      <w:r>
+        <w:rPr>
+          <w:rFonts w:ascii="Arial" w:hAnsi="Arial" w:cs="Arial"/>
+          <w:color w:val="7030A0"/>
+          <w:sz w:val="24"/>
+          <w:szCs w:val="24"/>
+          <w:lang w:val="fr-FR"/>
+        </w:rPr>
+        <w:tab/>
+      </w:r>
+      <w:r>
+        <w:rPr>
+          <w:rFonts w:ascii="Arial" w:hAnsi="Arial" w:cs="Arial"/>
+          <w:color w:val="7030A0"/>
+          <w:sz w:val="24"/>
+          <w:szCs w:val="24"/>
+          <w:lang w:val="fr-FR"/>
+        </w:rPr>
+        <w:tab/>
+      </w:r>
+      <w:r>
+        <w:rPr>
+          <w:rFonts w:ascii="Arial" w:hAnsi="Arial" w:cs="Arial"/>
+          <w:color w:val="7030A0"/>
+          <w:sz w:val="24"/>
+          <w:szCs w:val="24"/>
+          <w:lang w:val="fr-FR"/>
+        </w:rPr>
+        <w:t xml:space="preserve">  l</w:t>
+      </w:r>
+      <w:r>
+        <w:rPr>
+          <w:rFonts w:ascii="Arial" w:hAnsi="Arial" w:cs="Arial"/>
+          <w:color w:val="7030A0"/>
+          <w:sz w:val="24"/>
+          <w:szCs w:val="24"/>
+          <w:lang w:val="fr-FR"/>
+        </w:rPr>
+        <w:t>og(PSA)</w:t>
+      </w:r>
+    </w:p>
+    <w:p>
+      <w:pPr>
+        <w:widowControl w:val="0"/>
+        <w:tabs>
+          <w:tab w:val="left" w:pos="220"/>
+          <w:tab w:val="left" w:pos="720"/>
+        </w:tabs>
+        <w:autoSpaceDE w:val="0"/>
+        <w:autoSpaceDN w:val="0"/>
+        <w:adjustRightInd w:val="0"/>
+        <w:spacing w:after="293" w:line="340" w:lineRule="atLeast"/>
+        <w:rPr>
+          <w:rFonts w:ascii="Arial" w:hAnsi="Arial" w:cs="Arial"/>
+          <w:color w:val="000000"/>
+          <w:sz w:val="24"/>
+          <w:szCs w:val="24"/>
+          <w:lang w:val="fr-FR"/>
         </w:rPr>
       </w:pPr>
     </w:p>
@@ -13339,31 +13751,13 @@
         <w:spacing w:after="293" w:line="340" w:lineRule="atLeast"/>
         <w:rPr>
           <w:rFonts w:ascii="Arial" w:hAnsi="Arial" w:cs="Arial"/>
-          <w:color w:val="000000"/>
-          <w:sz w:val="24"/>
-          <w:szCs w:val="24"/>
-        </w:rPr>
-      </w:pPr>
-    </w:p>
-    <w:p>
-      <w:pPr>
-        <w:widowControl w:val="0"/>
-        <w:tabs>
-          <w:tab w:val="left" w:pos="220"/>
-          <w:tab w:val="left" w:pos="720"/>
-        </w:tabs>
-        <w:autoSpaceDE w:val="0"/>
-        <w:autoSpaceDN w:val="0"/>
-        <w:adjustRightInd w:val="0"/>
-        <w:spacing w:after="293" w:line="340" w:lineRule="atLeast"/>
-        <w:rPr>
-          <w:rFonts w:ascii="Arial" w:hAnsi="Arial" w:cs="Arial"/>
           <w:b/>
           <w:bCs/>
           <w:color w:val="000000"/>
           <w:sz w:val="24"/>
           <w:szCs w:val="24"/>
           <w:u w:val="single"/>
+          <w:lang w:val="fr-FR"/>
         </w:rPr>
       </w:pPr>
       <w:r>
@@ -13375,6 +13769,7 @@
           <w:sz w:val="24"/>
           <w:szCs w:val="24"/>
           <w:u w:val="single"/>
+          <w:lang w:val="fr-FR"/>
         </w:rPr>
         <w:t>PART III</w:t>
       </w:r>
@@ -13453,17 +13848,7 @@
           <w:sz w:val="24"/>
           <w:szCs w:val="24"/>
         </w:rPr>
-        <w:t xml:space="preserve"> for the </w:t>
-      </w:r>
-      <w:r>
-        <w:rPr>
-          <w:rFonts w:ascii="Arial" w:hAnsi="Arial" w:cs="Arial"/>
-          <w:color w:val="000000"/>
-          <w:sz w:val="24"/>
-          <w:szCs w:val="24"/>
-        </w:rPr>
-        <w:lastRenderedPageBreak/>
-        <w:t xml:space="preserve">associations between capsular penetration, cancer volume and Log PSA from model 4 to those in models 2 and 3. Describe what changes you see across the different models. </w:t>
+        <w:t xml:space="preserve"> for the associations between capsular penetration, cancer volume and Log PSA from model 4 to those in models 2 and 3. Describe what changes you see across the different models. </w:t>
       </w:r>
       <w:r>
         <w:rPr>
@@ -13494,63 +13879,36 @@
           <w:szCs w:val="24"/>
         </w:rPr>
       </w:pPr>
-    </w:p>
-    <w:p>
-      <w:pPr>
-        <w:widowControl w:val="0"/>
-        <w:tabs>
-          <w:tab w:val="left" w:pos="220"/>
-          <w:tab w:val="left" w:pos="720"/>
-        </w:tabs>
-        <w:autoSpaceDE w:val="0"/>
-        <w:autoSpaceDN w:val="0"/>
-        <w:adjustRightInd w:val="0"/>
-        <w:spacing w:after="293" w:line="340" w:lineRule="atLeast"/>
+      <w:r>
         <w:rPr>
           <w:rFonts w:ascii="Arial" w:eastAsia="MS Mincho" w:hAnsi="Arial" w:cs="Arial"/>
           <w:color w:val="000000"/>
           <w:sz w:val="24"/>
           <w:szCs w:val="24"/>
         </w:rPr>
-      </w:pPr>
-    </w:p>
-    <w:p>
-      <w:pPr>
-        <w:widowControl w:val="0"/>
-        <w:tabs>
-          <w:tab w:val="left" w:pos="220"/>
-          <w:tab w:val="left" w:pos="720"/>
-        </w:tabs>
-        <w:autoSpaceDE w:val="0"/>
-        <w:autoSpaceDN w:val="0"/>
-        <w:adjustRightInd w:val="0"/>
-        <w:spacing w:after="293" w:line="340" w:lineRule="atLeast"/>
+        <w:t xml:space="preserve">Model 2: </w:t>
+      </w:r>
+      <w:proofErr w:type="spellStart"/>
+      <w:r>
         <w:rPr>
           <w:rFonts w:ascii="Arial" w:eastAsia="MS Mincho" w:hAnsi="Arial" w:cs="Arial"/>
           <w:color w:val="000000"/>
           <w:sz w:val="24"/>
           <w:szCs w:val="24"/>
         </w:rPr>
-      </w:pPr>
-    </w:p>
-    <w:p>
-      <w:pPr>
-        <w:widowControl w:val="0"/>
-        <w:tabs>
-          <w:tab w:val="left" w:pos="220"/>
-          <w:tab w:val="left" w:pos="720"/>
-        </w:tabs>
-        <w:autoSpaceDE w:val="0"/>
-        <w:autoSpaceDN w:val="0"/>
-        <w:adjustRightInd w:val="0"/>
-        <w:spacing w:after="293" w:line="340" w:lineRule="atLeast"/>
+        <w:t>Cavol</w:t>
+      </w:r>
+      <w:proofErr w:type="spellEnd"/>
+      <w:r>
         <w:rPr>
           <w:rFonts w:ascii="Arial" w:eastAsia="MS Mincho" w:hAnsi="Arial" w:cs="Arial"/>
           <w:color w:val="000000"/>
           <w:sz w:val="24"/>
           <w:szCs w:val="24"/>
         </w:rPr>
-      </w:pPr>
+        <w:t xml:space="preserve"> and </w:t>
+      </w:r>
+      <w:proofErr w:type="spellStart"/>
       <w:r>
         <w:rPr>
           <w:rFonts w:ascii="Arial" w:eastAsia="MS Mincho" w:hAnsi="Arial" w:cs="Arial"/>
@@ -13558,9 +13916,9 @@
           <w:sz w:val="24"/>
           <w:szCs w:val="24"/>
         </w:rPr>
-        <w:t xml:space="preserve">Model 2: </w:t>
-      </w:r>
-      <w:proofErr w:type="spellStart"/>
+        <w:t>Cappen</w:t>
+      </w:r>
+      <w:proofErr w:type="spellEnd"/>
       <w:r>
         <w:rPr>
           <w:rFonts w:ascii="Arial" w:eastAsia="MS Mincho" w:hAnsi="Arial" w:cs="Arial"/>
@@ -13568,9 +13926,8 @@
           <w:sz w:val="24"/>
           <w:szCs w:val="24"/>
         </w:rPr>
-        <w:t>Cavol</w:t>
-      </w:r>
-      <w:proofErr w:type="spellEnd"/>
+        <w:t xml:space="preserve"> in the model</w:t>
+      </w:r>
       <w:r>
         <w:rPr>
           <w:rFonts w:ascii="Arial" w:eastAsia="MS Mincho" w:hAnsi="Arial" w:cs="Arial"/>
@@ -13578,9 +13935,8 @@
           <w:sz w:val="24"/>
           <w:szCs w:val="24"/>
         </w:rPr>
-        <w:t xml:space="preserve"> and </w:t>
-      </w:r>
-      <w:proofErr w:type="spellStart"/>
+        <w:tab/>
+      </w:r>
       <w:r>
         <w:rPr>
           <w:rFonts w:ascii="Arial" w:eastAsia="MS Mincho" w:hAnsi="Arial" w:cs="Arial"/>
@@ -13588,9 +13944,8 @@
           <w:sz w:val="24"/>
           <w:szCs w:val="24"/>
         </w:rPr>
-        <w:t>Cappen</w:t>
-      </w:r>
-      <w:proofErr w:type="spellEnd"/>
+        <w:tab/>
+      </w:r>
       <w:r>
         <w:rPr>
           <w:rFonts w:ascii="Arial" w:eastAsia="MS Mincho" w:hAnsi="Arial" w:cs="Arial"/>
@@ -13598,7 +13953,16 @@
           <w:sz w:val="24"/>
           <w:szCs w:val="24"/>
         </w:rPr>
-        <w:t xml:space="preserve"> in the model</w:t>
+        <w:tab/>
+      </w:r>
+      <w:r>
+        <w:rPr>
+          <w:rFonts w:ascii="Arial" w:eastAsia="MS Mincho" w:hAnsi="Arial" w:cs="Arial"/>
+          <w:color w:val="000000"/>
+          <w:sz w:val="24"/>
+          <w:szCs w:val="24"/>
+        </w:rPr>
+        <w:tab/>
       </w:r>
     </w:p>
     <w:tbl>
@@ -14791,25 +15155,6 @@
           <w:szCs w:val="24"/>
         </w:rPr>
       </w:pPr>
-    </w:p>
-    <w:p>
-      <w:pPr>
-        <w:widowControl w:val="0"/>
-        <w:tabs>
-          <w:tab w:val="left" w:pos="220"/>
-          <w:tab w:val="left" w:pos="720"/>
-        </w:tabs>
-        <w:autoSpaceDE w:val="0"/>
-        <w:autoSpaceDN w:val="0"/>
-        <w:adjustRightInd w:val="0"/>
-        <w:spacing w:after="293" w:line="340" w:lineRule="atLeast"/>
-        <w:rPr>
-          <w:rFonts w:ascii="Arial" w:eastAsia="MS Mincho" w:hAnsi="Arial" w:cs="Arial"/>
-          <w:color w:val="000000"/>
-          <w:sz w:val="24"/>
-          <w:szCs w:val="24"/>
-        </w:rPr>
-      </w:pPr>
       <w:r>
         <w:rPr>
           <w:rFonts w:ascii="Arial" w:eastAsia="MS Mincho" w:hAnsi="Arial" w:cs="Arial"/>
@@ -15724,25 +16069,6 @@
           <w:szCs w:val="24"/>
         </w:rPr>
       </w:pPr>
-    </w:p>
-    <w:p>
-      <w:pPr>
-        <w:widowControl w:val="0"/>
-        <w:tabs>
-          <w:tab w:val="left" w:pos="220"/>
-          <w:tab w:val="left" w:pos="720"/>
-        </w:tabs>
-        <w:autoSpaceDE w:val="0"/>
-        <w:autoSpaceDN w:val="0"/>
-        <w:adjustRightInd w:val="0"/>
-        <w:spacing w:after="293" w:line="340" w:lineRule="atLeast"/>
-        <w:rPr>
-          <w:rFonts w:ascii="Arial" w:eastAsia="MS Mincho" w:hAnsi="Arial" w:cs="Arial"/>
-          <w:color w:val="000000"/>
-          <w:sz w:val="24"/>
-          <w:szCs w:val="24"/>
-        </w:rPr>
-      </w:pPr>
       <w:r>
         <w:rPr>
           <w:rFonts w:ascii="Arial" w:eastAsia="MS Mincho" w:hAnsi="Arial" w:cs="Arial"/>
@@ -16733,25 +17059,6 @@
         <w:adjustRightInd w:val="0"/>
         <w:spacing w:after="293" w:line="340" w:lineRule="atLeast"/>
         <w:rPr>
-          <w:rFonts w:ascii="MS Mincho" w:eastAsia="MS Mincho" w:hAnsi="MS Mincho" w:cs="MS Mincho"/>
-          <w:color w:val="000000"/>
-          <w:sz w:val="24"/>
-          <w:szCs w:val="24"/>
-        </w:rPr>
-      </w:pPr>
-    </w:p>
-    <w:p>
-      <w:pPr>
-        <w:widowControl w:val="0"/>
-        <w:tabs>
-          <w:tab w:val="left" w:pos="220"/>
-          <w:tab w:val="left" w:pos="720"/>
-        </w:tabs>
-        <w:autoSpaceDE w:val="0"/>
-        <w:autoSpaceDN w:val="0"/>
-        <w:adjustRightInd w:val="0"/>
-        <w:spacing w:after="293" w:line="340" w:lineRule="atLeast"/>
-        <w:rPr>
           <w:rFonts w:ascii="Arial" w:hAnsi="Arial" w:cs="Arial"/>
           <w:color w:val="000000"/>
           <w:sz w:val="24"/>
@@ -16789,23 +17096,47 @@
           <w:sz w:val="24"/>
           <w:szCs w:val="24"/>
         </w:rPr>
+        <w:lastRenderedPageBreak/>
         <w:t>Write a summary of your findings regarding capsular penetration and its value as a predictor of PSA both alone and in the presence of the other covariates.</w:t>
       </w:r>
     </w:p>
     <w:p>
       <w:pPr>
-        <w:rPr>
-          <w:rFonts w:ascii="Arial" w:hAnsi="Arial" w:cs="Arial"/>
-          <w:color w:val="000000"/>
+        <w:pStyle w:val="ListParagraph"/>
+        <w:widowControl w:val="0"/>
+        <w:numPr>
+          <w:ilvl w:val="0"/>
+          <w:numId w:val="11"/>
+        </w:numPr>
+        <w:tabs>
+          <w:tab w:val="left" w:pos="220"/>
+          <w:tab w:val="left" w:pos="720"/>
+        </w:tabs>
+        <w:autoSpaceDE w:val="0"/>
+        <w:autoSpaceDN w:val="0"/>
+        <w:adjustRightInd w:val="0"/>
+        <w:spacing w:after="293" w:line="340" w:lineRule="atLeast"/>
+        <w:rPr>
+          <w:rFonts w:ascii="Arial" w:hAnsi="Arial" w:cs="Arial"/>
+          <w:color w:val="7030A0"/>
           <w:sz w:val="24"/>
           <w:szCs w:val="24"/>
         </w:rPr>
       </w:pPr>
+      <w:r>
+        <w:rPr>
+          <w:rFonts w:ascii="Arial" w:hAnsi="Arial" w:cs="Arial"/>
+          <w:color w:val="7030A0"/>
+          <w:sz w:val="24"/>
+          <w:szCs w:val="24"/>
+        </w:rPr>
+        <w:t>Capsular Penetration is a strong predictor on its own, but it is strongly associated with cancer volume so we recommend only including one in the model.</w:t>
+      </w:r>
     </w:p>
     <w:sectPr>
-      <w:headerReference w:type="even" r:id="rId11"/>
-      <w:headerReference w:type="default" r:id="rId12"/>
-      <w:footerReference w:type="default" r:id="rId13"/>
+      <w:headerReference w:type="even" r:id="rId15"/>
+      <w:headerReference w:type="default" r:id="rId16"/>
+      <w:footerReference w:type="default" r:id="rId17"/>
       <w:pgSz w:w="12240" w:h="15840"/>
       <w:pgMar w:top="720" w:right="720" w:bottom="720" w:left="720" w:header="720" w:footer="720" w:gutter="0"/>
       <w:cols w:space="720"/>
@@ -17181,7 +17512,7 @@
   <w:abstractNum w:abstractNumId="2" w15:restartNumberingAfterBreak="0">
     <w:nsid w:val="0C472640"/>
     <w:multiLevelType w:val="hybridMultilevel"/>
-    <w:tmpl w:val="0FBE5F0A"/>
+    <w:tmpl w:val="8856E37A"/>
     <w:lvl w:ilvl="0" w:tplc="04090001">
       <w:start w:val="1"/>
       <w:numFmt w:val="bullet"/>
@@ -18886,11 +19217,13 @@
     <w:rsid w:val="00415CCC"/>
     <w:rsid w:val="00623041"/>
     <w:rsid w:val="00723F3C"/>
+    <w:rsid w:val="008A15C3"/>
     <w:rsid w:val="009840A1"/>
     <w:rsid w:val="00AA65C1"/>
     <w:rsid w:val="00AB21BB"/>
     <w:rsid w:val="00B04571"/>
     <w:rsid w:val="00B8665A"/>
+    <w:rsid w:val="00B901E9"/>
     <w:rsid w:val="00CB2B43"/>
     <w:rsid w:val="00D05AED"/>
     <w:rsid w:val="00E563DC"/>
@@ -19360,6 +19693,61 @@
 </w:webSettings>
 </file>
 
+<file path=word/ink/ink1.xml><?xml version="1.0" encoding="utf-8"?>
+<inkml:ink xmlns:inkml="http://www.w3.org/2003/InkML">
+  <inkml:definitions>
+    <inkml:context xml:id="ctx0">
+      <inkml:inkSource xml:id="inkSrc0">
+        <inkml:traceFormat>
+          <inkml:channel name="X" type="integer" min="-2.14748E9" max="2.14748E9" units="cm"/>
+          <inkml:channel name="Y" type="integer" min="-2.14748E9" max="2.14748E9" units="cm"/>
+          <inkml:channel name="F" type="integer" max="32767" units="dev"/>
+        </inkml:traceFormat>
+        <inkml:channelProperties>
+          <inkml:channelProperty channel="X" name="resolution" value="1000" units="1/cm"/>
+          <inkml:channelProperty channel="Y" name="resolution" value="1000" units="1/cm"/>
+          <inkml:channelProperty channel="F" name="resolution" value="0" units="1/dev"/>
+        </inkml:channelProperties>
+      </inkml:inkSource>
+      <inkml:timestamp xml:id="ts0" timeString="2026-02-23T20:15:56.553"/>
+    </inkml:context>
+    <inkml:brush xml:id="br0">
+      <inkml:brushProperty name="width" value="0.035" units="cm"/>
+      <inkml:brushProperty name="height" value="0.035" units="cm"/>
+    </inkml:brush>
+  </inkml:definitions>
+  <inkml:trace contextRef="#ctx0" brushRef="#br0">1 618 24575,'5'3'0,"2"0"0,3-3 0,7 0 0,18-2 0,-3-4 0,13-5 0,-10-2 0,1-1 0,18-8 0,-10 6 0,12-8 0,-13 9 0,1-1 0,0 0 0,-1 0 0,-4-1 0,-5 4 0,-2 0 0,-2 2 0,-6 2 0,-2 1 0,-3 3 0,0 0 0,0 0 0,0-3 0,1 1 0,0-1 0,2 0 0,-2 0 0,1 0 0,7-2 0,-9 1 0,10-2 0,-12 4 0,4 0 0,-2-1 0,-1-1 0,-1-1 0,-1 1 0,-2 1 0,1 1 0,-2 1 0,-1-2 0,0 0 0,1 0 0,1 0 0,1 2 0,-2 1 0,0-1 0,0-1 0,0 1 0,5-1 0,-5 4 0,2-2 0,-7 2 0,0 0 0,-1-1 0,1 1 0,1 0 0,0-1 0,1 1 0,-1-2 0,-1 1 0,1 0 0,-2 1 0,2-1 0,1 1 0,0-1 0,1 0 0,-2 2 0,0 0 0,-2 0 0,2 1 0,-3-1 0,3 0 0,-6 2 0,-2 0 0,-6 0 0,-7 0 0,-10 0 0,-11 0 0,-1 0 0,-13 0 0,19 0 0,-7 0 0,13-1 0,0-1 0,0-2 0,2 1 0,2-1 0,1 0 0,3 0 0,4 1 0,1 1 0,3 0 0,1 1 0,0-2 0,2-1 0,2-1 0,4 1 0,6 1 0,5-1 0,4-1 0,2 1 0,0 0 0,2 0 0,-3 2 0,0-1 0,0 2 0,-2 1 0,1 0 0,-1 0 0,1 0 0,-1 0 0,-1 0 0,-1 0 0,0 0 0,0 0 0,-5 0 0,0 0 0,-4 0 0,0 0 0,0 1 0,-2 2 0,-2 1 0,-2 2 0,0-1 0,0 1 0,0 0 0,0 1 0,0-1 0,-1 0 0,-1-2 0,-1 3 0,0-2 0,0 4 0,0-3 0,0 0 0,-1 0 0,2 1 0,1 1 0,-1 1 0,0 1 0,0 1 0,0 0 0,0 1 0,-1 2 0,0 3 0,-1-2 0,0 0 0,0-1 0,1-2 0,-1 0 0,-1 1 0,2-5 0,-1 2 0,1-4 0,-1 2 0,0 0 0,1 1 0,-1-1 0,1 1 0,-1 2 0,1-1 0,-1 1 0,2-2 0,0 0 0,0 0 0,0 0 0,-1 0 0,1-2 0,0 0 0,1 0 0,0-3 0,1-4 0,0-7 0,0-9 0,0-9 0,0-9 0,0 15 0,0 2 0</inkml:trace>
+</inkml:ink>
+</file>
+
+<file path=word/ink/ink2.xml><?xml version="1.0" encoding="utf-8"?>
+<inkml:ink xmlns:inkml="http://www.w3.org/2003/InkML">
+  <inkml:definitions>
+    <inkml:context xml:id="ctx0">
+      <inkml:inkSource xml:id="inkSrc0">
+        <inkml:traceFormat>
+          <inkml:channel name="X" type="integer" min="-2.14748E9" max="2.14748E9" units="cm"/>
+          <inkml:channel name="Y" type="integer" min="-2.14748E9" max="2.14748E9" units="cm"/>
+          <inkml:channel name="F" type="integer" max="32767" units="dev"/>
+        </inkml:traceFormat>
+        <inkml:channelProperties>
+          <inkml:channelProperty channel="X" name="resolution" value="1000" units="1/cm"/>
+          <inkml:channelProperty channel="Y" name="resolution" value="1000" units="1/cm"/>
+          <inkml:channelProperty channel="F" name="resolution" value="0" units="1/dev"/>
+        </inkml:channelProperties>
+      </inkml:inkSource>
+      <inkml:timestamp xml:id="ts0" timeString="2026-02-23T20:15:59.891"/>
+    </inkml:context>
+    <inkml:brush xml:id="br0">
+      <inkml:brushProperty name="width" value="0.035" units="cm"/>
+      <inkml:brushProperty name="height" value="0.035" units="cm"/>
+    </inkml:brush>
+  </inkml:definitions>
+  <inkml:trace contextRef="#ctx0" brushRef="#br0">0 1162 24575,'19'0'0,"19"0"0,-2 0 0,20 0 0,-6 0 0,20 0 0,-6 0 0,23 0 0,-23 0 0,12 0 0,-7 0 0,12 0 0,6 0 0,5 0 0,-8 0 0,-4 0 0,-6 0 0,4 0 0,14 0 0,-11 0 0,-23 0 0,0 0 0,15 0 0,-23 0 0,0 0 0,18 0 0,-3 0 0,-3 0 0,-3 0 0,-2 0 0,-3 1 0,-3 1 0,-2 2 0,1 2 0,6 0 0,2-1 0,0 0 0,1-2 0,-3 1 0,-4 1 0,14 2 0,-22-4 0,11 1 0,-21-4 0,3 0 0,1 0 0,3 0 0,3 0 0,-1 0 0,1 0 0,0 0 0,-3 0 0,-3 0 0,-4 0 0,-2 0 0,3 1 0,4 1 0,0 2 0,-1 2 0,-2-1 0,-2 1 0,-1-1 0,9-3 0,-13 0 0,11-2 0,-14 0 0,3 1 0,-2 1 0,0 0 0,-4 0 0,-2-2 0,-6 0 0,-2 0 0,-3 0 0,-3 0 0,1 0 0,-2 0 0,3 0 0,-1 0 0,5 0 0,0 0 0,6 0 0,4 0 0,2 0 0,1 0 0,-4 0 0,0 2 0,-4 0 0,-4 0 0,-5 0 0,-3-2 0,-1 0 0,1 0 0,2 0 0,2 0 0,2 0 0,4 0 0,4 0 0,-1 0 0,9 0 0,-11 0 0,6 0 0,-10 0 0,0 0 0,-2 0 0,-2 0 0,-2 0 0,0 0 0,-3 0 0,-5 0 0,-5 0 0,-12-2 0,-14-4 0,-11-5 0,-7-8 0,-19-13 0,25 10 0,-19-10 0,24 14 0,-2-1 0,4 1 0,6 4 0,6 3 0,6 1 0,5 4 0,8 2 0,7 2 0,6 2 0,7 2 0,12 2 0,15 9 0,-1-2 0,11 8 0,-13-4 0,6 3 0,-3 0 0,-4-2 0,-5-3 0,-7-3 0,-7-3 0,-5-1 0,-4-1 0,-2-1 0,0 0 0,-1 0 0,-2 0 0,-2 1 0,-1 1 0,-1-1 0,0 1 0,-1 0 0,-2 0 0,-4 1 0,-3 2 0,-4 0 0,-3 2 0,0 0 0,2-2 0,3 1 0,0 0 0,0 1 0,-1 1 0,2 1 0,1 0 0,0 0 0,3 0 0,-1-2 0,-1 6 0,2-5 0,-1 4 0,3-5 0,0 0 0,1-1 0,-1 1 0,0-2 0,1 0 0,-1-2 0,2-1 0,1 0 0,-1 0 0,2-1 0,-1 1 0,-1 0 0,1-1 0,0-1 0,0 0 0,0 0 0,0-2 0,1-4 0,1-6 0,0 2 0,-1-1 0</inkml:trace>
+  <inkml:trace contextRef="#ctx0" brushRef="#br0" timeOffset="2912">3388 0 24575,'20'0'0,"54"1"0,12 0 0,-2 3 0,-9 0 0,13 0 0,-12 3 0,11 9 0,-29-4 0,1 0 0,21 9 0,-16-1 0,2 0 0,-4 3 0,10 7 0,-17-7 0,6 6 0,-24-11 0,1 0 0,-2 0 0,0 0 0,0-2 0,-3 0 0,-1-2 0,0 0 0,-2 0 0,-4-2 0,-4-2 0,0 2 0,13 6 0,-8-4 0,9 6 0,-14-8 0,1 0 0,1 0 0,8 3 0,-11-3 0,8 1 0,-12-3 0,-1 0 0,-1-1 0,-1 0 0,-1-1 0,0-1 0,-1 1 0,0-1 0,0-1 0,0 0 0,0 1 0,0 1 0,1 0 0,-2 1 0,-1-1 0,-3-3 0,0 0 0,-1-2 0,-4-5 0,-5-4 0,-5-7 0,-4-4 0,-5-4 0,-11-17 0,-3-5 0,3 2 0,5 4 0,8 13 0,6 9 0,-1 0 0,8 14 0,3 5 0,4 5 0,13 17 0,2 0 0,10 13 0,8 11 0,-9-15 0,11 17 0,-13-19 0,1 1 0,-3-2 0,-5-4 0,-5-5 0,-4-5 0,-4-4 0,0-5 0,-2-2 0,-1-1 0,-3-1 0,-1 1 0,-1 0 0,-4-1 0,-4-1 0,-9-2 0,-1 0 0,-12-2 0,-2 0 0,-8 0 0,-8 0 0,-6 0 0,-2 0 0,-1 0 0,3 0 0,6-2 0,2-3 0,12 0 0,8 1 0,8 2 0,5 2 0,2 0 0,5 0 0,5 0 0,7 0 0,1 0 0,0 0 0,-3 0 0</inkml:trace>
+</inkml:ink>
+</file>
+
 <file path=word/theme/theme1.xml><?xml version="1.0" encoding="utf-8"?>
 <a:theme xmlns:a="http://schemas.openxmlformats.org/drawingml/2006/main" name="Office Theme">
   <a:themeElements>

</xml_diff>